<commit_message>
docs: update report with student ID DTC245200207 and system status
</commit_message>
<xml_diff>
--- a/docs/BaoCao_BaiTapLon_TKQT_HTPM_K23_De18_BillingSystem_IP_192.168.38.129.docx
+++ b/docs/BaoCao_BaiTapLon_TKQT_HTPM_K23_De18_BillingSystem_IP_192.168.38.129.docx
@@ -185,7 +185,7 @@
                 <w:color w:val="1E3A8A"/>
                 <w:sz w:val="22"/>
               </w:rPr>
-              <w:t>NGUYỄN VĂN AN (Họ và tên SV)</w:t>
+              <w:t>LỘC MINH TUẤN</w:t>
             </w:r>
           </w:p>
         </w:tc>
@@ -224,7 +224,7 @@
                 <w:color w:val="1E3A8A"/>
                 <w:sz w:val="22"/>
               </w:rPr>
-              <w:t>DTC245200xxx (Điền MSV của bạn)</w:t>
+              <w:t>DTC245200207</w:t>
             </w:r>
           </w:p>
         </w:tc>
@@ -263,7 +263,85 @@
                 <w:color w:val="1E3A8A"/>
                 <w:sz w:val="22"/>
               </w:rPr>
-              <w:t>CNTTK23 - K23</w:t>
+              <w:t>CNTT K23 - Khóa 23</w:t>
+            </w:r>
+          </w:p>
+        </w:tc>
+      </w:tr>
+      <w:tr>
+        <w:tc>
+          <w:tcPr>
+            <w:tcW w:type="dxa" w:w="4032"/>
+          </w:tcPr>
+          <w:p>
+            <w:pPr>
+              <w:spacing w:before="60" w:after="60"/>
+            </w:pPr>
+            <w:r>
+              <w:rPr>
+                <w:rFonts w:ascii="Times New Roman" w:hAnsi="Times New Roman"/>
+                <w:b/>
+                <w:sz w:val="22"/>
+              </w:rPr>
+              <w:t>ĐỊA CHỈ IP MÁY ẢO UBUNTU:</w:t>
+            </w:r>
+          </w:p>
+        </w:tc>
+        <w:tc>
+          <w:tcPr>
+            <w:tcW w:type="dxa" w:w="4608"/>
+          </w:tcPr>
+          <w:p>
+            <w:pPr>
+              <w:spacing w:before="60" w:after="60"/>
+            </w:pPr>
+            <w:r>
+              <w:rPr>
+                <w:rFonts w:ascii="Times New Roman" w:hAnsi="Times New Roman"/>
+                <w:b/>
+                <w:color w:val="1E3A8A"/>
+                <w:sz w:val="22"/>
+              </w:rPr>
+              <w:t>192.168.38.129</w:t>
+            </w:r>
+          </w:p>
+        </w:tc>
+      </w:tr>
+      <w:tr>
+        <w:tc>
+          <w:tcPr>
+            <w:tcW w:type="dxa" w:w="4032"/>
+          </w:tcPr>
+          <w:p>
+            <w:pPr>
+              <w:spacing w:before="60" w:after="60"/>
+            </w:pPr>
+            <w:r>
+              <w:rPr>
+                <w:rFonts w:ascii="Times New Roman" w:hAnsi="Times New Roman"/>
+                <w:b/>
+                <w:sz w:val="22"/>
+              </w:rPr>
+              <w:t>REPOSITORY GITHUB:</w:t>
+            </w:r>
+          </w:p>
+        </w:tc>
+        <w:tc>
+          <w:tcPr>
+            <w:tcW w:type="dxa" w:w="4608"/>
+          </w:tcPr>
+          <w:p>
+            <w:pPr>
+              <w:spacing w:before="60" w:after="60"/>
+            </w:pPr>
+            <w:r>
+              <w:rPr>
+                <w:rFonts w:ascii="Times New Roman" w:hAnsi="Times New Roman"/>
+                <w:b/>
+                <w:color w:val="1E3A8A"/>
+                <w:sz w:val="22"/>
+              </w:rPr>
+              <w:t>https://github.com/tuan2307106/billing-system-dtc245200207</w:t>
             </w:r>
           </w:p>
         </w:tc>
@@ -1620,9 +1698,9 @@
               <w:br/>
               <w:t xml:space="preserve">   [ Container Logs ] ---&gt; [ billing-promtail ] ---&gt; [ billing-loki:3100 ]</w:t>
               <w:br/>
-              <w:t xml:space="preserve">   [ System Metrics ] ---&gt; [ billing-cadvisor ]</w:t>
+              <w:t xml:space="preserve">   [ System Metrics ] ---&gt; [ billing-cadvisor:8088 ]</w:t>
               <w:br/>
-              <w:t xml:space="preserve">   [ DB Metrics ]     ---&gt; [ postgres_exporter ] ---&gt; [ Prometheus:9090 ]</w:t>
+              <w:t xml:space="preserve">   [ DB Metrics ]     ---&gt; [ postgres_exporter ] ---&gt; [ Prometheus:9091 ]</w:t>
               <w:br/>
               <w:t xml:space="preserve">   [ Web Metrics ]    ---&gt; [ billing-web:5000 ]</w:t>
               <w:br/>
@@ -1630,7 +1708,7 @@
               <w:br/>
               <w:t xml:space="preserve">                                    v</w:t>
               <w:br/>
-              <w:t xml:space="preserve">                        [ billing-grafana:3000 Dashboard ]</w:t>
+              <w:t xml:space="preserve">                        [ billing-grafana:3001 Dashboard ]</w:t>
             </w:r>
           </w:p>
         </w:tc>
@@ -1778,7 +1856,7 @@
           <w:rFonts w:ascii="Times New Roman" w:hAnsi="Times New Roman"/>
           <w:sz w:val="24"/>
         </w:rPr>
-        <w:t>Cấu hình tường lửa Uncomplicated Firewall (UFW) cho phép lưu lượng truy cập tại các cổng dịch vụ cần thiết (80, 443, 3000, 5050, 9090).</w:t>
+        <w:t>Cấu hình tường lửa Uncomplicated Firewall (UFW) cho phép lưu lượng truy cập tại các cổng dịch vụ cần thiết (80, 443, 3001, 5050, 8088, 9091).</w:t>
       </w:r>
     </w:p>
     <w:tbl>
@@ -1886,7 +1964,7 @@
           <w:rFonts w:ascii="Times New Roman" w:hAnsi="Times New Roman"/>
           <w:sz w:val="24"/>
         </w:rPr>
-        <w:t>billing-system-dtc245200xxx (đặt theo mã số SV cá nhân).</w:t>
+        <w:t>billing-system-dtc245200207 (đặt theo mã số SV cá nhân).</w:t>
       </w:r>
     </w:p>
     <w:p>
@@ -2201,6 +2279,93 @@
         </w:rPr>
         <w:t>Ứng dụng Smart Billing System được phát triển bằng ngôn ngữ Python với framework Flask, kết hợp thư viện psycopg2-binary kết nối cơ sở dữ liệu quan hệ PostgreSQL 16. Toàn bộ mã nguồn được tối ưu để vận hành trong container với người dùng không có đặc quyền root (appuser UID 1001).</w:t>
       </w:r>
+    </w:p>
+    <w:p>
+      <w:pPr>
+        <w:spacing w:before="0" w:after="80" w:line="312" w:lineRule="auto"/>
+        <w:jc w:val="both"/>
+      </w:pPr>
+      <w:r>
+        <w:rPr>
+          <w:rFonts w:ascii="Times New Roman" w:hAnsi="Times New Roman"/>
+          <w:color w:val="1E293B"/>
+          <w:sz w:val="24"/>
+        </w:rPr>
+        <w:t>Trạng thái các container của hệ thống sau khi triển khai bằng Docker Compose:</w:t>
+      </w:r>
+    </w:p>
+    <w:tbl>
+      <w:tblPr>
+        <w:tblW w:type="auto" w:w="0"/>
+        <w:jc w:val="center"/>
+        <w:tblLayout w:type="fixed"/>
+        <w:tblLook w:firstColumn="1" w:firstRow="1" w:lastColumn="0" w:lastRow="0" w:noHBand="0" w:noVBand="1" w:val="04A0"/>
+      </w:tblPr>
+      <w:tblGrid>
+        <w:gridCol w:w="9403"/>
+      </w:tblGrid>
+      <w:tr>
+        <w:tc>
+          <w:tcPr>
+            <w:tcW w:type="dxa" w:w="9072"/>
+            <w:shd w:fill="F8FAFC"/>
+            <w:tcMar>
+              <w:top w:w="100" w:type="dxa"/>
+              <w:bottom w:w="100" w:type="dxa"/>
+              <w:left w:w="150" w:type="dxa"/>
+              <w:right w:w="150" w:type="dxa"/>
+            </w:tcMar>
+            <w:tcBorders>
+              <w:top w:val="single" w:sz="4" w:space="0" w:color="CBD5E1"/>
+              <w:left w:val="single" w:sz="24" w:space="0" w:color="0284C7"/>
+              <w:bottom w:val="single" w:sz="4" w:space="0" w:color="CBD5E1"/>
+              <w:right w:val="single" w:sz="4" w:space="0" w:color="CBD5E1"/>
+            </w:tcBorders>
+          </w:tcPr>
+          <w:p>
+            <w:pPr>
+              <w:spacing w:before="40" w:after="40" w:line="276" w:lineRule="auto"/>
+            </w:pPr>
+            <w:r>
+              <w:rPr>
+                <w:rFonts w:ascii="Consolas" w:hAnsi="Consolas"/>
+                <w:color w:val="0F172A"/>
+                <w:sz w:val="18"/>
+              </w:rPr>
+              <w:t>ubuntu@ubuntu-VMware-Virtual-Platform:~$ cd ~/billing-system-dtc245200207</w:t>
+              <w:br/>
+              <w:t>ubuntu@ubuntu-VMware-Virtual-Platform:~/billing-system-dtc245200207$ docker compose ps</w:t>
+              <w:br/>
+              <w:t>NAME                        IMAGE                          COMMAND                  SERVICE              STATUS              PORTS</w:t>
+              <w:br/>
+              <w:t>billing-cadvisor            gcr.io/cadvisor/cadvisor:v0.47.2 "/usr/bin/cadvisor -…"  cadvisor             Up (healthy)        0.0.0.0:8088-&gt;8080/tcp</w:t>
+              <w:br/>
+              <w:t>billing-db                  postgres:16-alpine             "docker-entrypoint.s…"   db                   Up (healthy)        5432/tcp</w:t>
+              <w:br/>
+              <w:t>billing-grafana             grafana/grafana:10.0.3         "/run.sh"                grafana              Up                  0.0.0.0:3001-&gt;3000/tcp</w:t>
+              <w:br/>
+              <w:t>billing-loki                grafana/loki:2.8.4             "/usr/bin/loki -conf…"   loki                 Up                  0.0.0.0:3100-&gt;3100/tcp</w:t>
+              <w:br/>
+              <w:t>billing-nginx               nginx:1.25-alpine              "/docker-entrypoint.…"   nginx                Up                  0.0.0.0:80-&gt;80/tcp, 0.0.0.0:443-&gt;443/tcp</w:t>
+              <w:br/>
+              <w:t>billing-pgadmin             dpage/pgadmin4:latest          "/entrypoint.sh"         pgadmin              Up                  0.0.0.0:5050-&gt;80/tcp</w:t>
+              <w:br/>
+              <w:t>billing-postgres-exporter   prometheuscommunity/postgres-exporter:v0.15.0 "/bin/postgres_expor…" postgres-exporter Up       9187/tcp</w:t>
+              <w:br/>
+              <w:t xml:space="preserve">billing-promtail            grafana/promtail:2.8.4         "/usr/bin/promtail -…"   promtail             Up                  </w:t>
+              <w:br/>
+              <w:t>billing-prometheus          prom/prometheus:v2.45.0        "/bin/prometheus --c…"   prometheus           Up                  0.0.0.0:9091-&gt;9090/tcp</w:t>
+              <w:br/>
+              <w:t>billing-web                 billing-system-billing-web     "gunicorn --bind 0.0…"   web                  Up (healthy)        5000/tcp</w:t>
+            </w:r>
+          </w:p>
+        </w:tc>
+      </w:tr>
+    </w:tbl>
+    <w:p>
+      <w:pPr>
+        <w:spacing w:after="80"/>
+      </w:pPr>
     </w:p>
     <w:p>
       <w:pPr>
@@ -2820,7 +2985,7 @@
           <w:b/>
           <w:sz w:val="24"/>
         </w:rPr>
-        <w:t>4. Target prometheus (Port 9090):</w:t>
+        <w:t>4. Target prometheus (Port 9091 trên Host, 9090 nội bộ):</w:t>
       </w:r>
       <w:r>
         <w:rPr>
@@ -2885,7 +3050,7 @@
           <w:color w:val="1E293B"/>
           <w:sz w:val="24"/>
         </w:rPr>
-        <w:t>Grafana 10.0.3 được triển khai tại cổng 3000, tích hợp sẵn cơ chế Provisioning tự động nạp nguồn dữ liệu Prometheus, Loki và Dashboard hoàn chỉnh mà người dùng không cần cấu hình bằng tay. Dashboard 'Smart Billing System - Tổng quan Giám sát Hạ tầng &amp; Nghiệp vụ' được thiết kế với các bảng điều khiển chuyên sâu:</w:t>
+        <w:t>Grafana 10.0.3 được triển khai tại cổng 3001 (để tránh xung đột cổng 3000 mặc định), tích hợp sẵn cơ chế Provisioning tự động nạp nguồn dữ liệu Prometheus, Loki và Dashboard hoàn chỉnh mà người dùng không cần cấu hình bằng tay. Dashboard 'Smart Billing System - Tổng quan Giám sát Hạ tầng &amp; Nghiệp vụ' được thiết kế với các bảng điều khiển chuyên sâu:</w:t>
       </w:r>
     </w:p>
     <w:p>
@@ -3050,7 +3215,7 @@
       <w:r>
         <w:drawing>
           <wp:inline xmlns:a="http://schemas.openxmlformats.org/drawingml/2006/main" xmlns:pic="http://schemas.openxmlformats.org/drawingml/2006/picture">
-            <wp:extent cx="5303520" cy="2680809"/>
+            <wp:extent cx="5303520" cy="3749754"/>
             <wp:docPr id="4" name="Picture 4"/>
             <wp:cNvGraphicFramePr>
               <a:graphicFrameLocks noChangeAspect="1"/>
@@ -3071,7 +3236,7 @@
                   <pic:spPr>
                     <a:xfrm>
                       <a:off x="0" y="0"/>
-                      <a:ext cx="5303520" cy="2680809"/>
+                      <a:ext cx="5303520" cy="3749754"/>
                     </a:xfrm>
                     <a:prstGeom prst="rect"/>
                   </pic:spPr>
@@ -3516,7 +3681,7 @@
       <w:r>
         <w:drawing>
           <wp:inline xmlns:a="http://schemas.openxmlformats.org/drawingml/2006/main" xmlns:pic="http://schemas.openxmlformats.org/drawingml/2006/picture">
-            <wp:extent cx="5303520" cy="2666960"/>
+            <wp:extent cx="5303520" cy="2439412"/>
             <wp:docPr id="5" name="Picture 5"/>
             <wp:cNvGraphicFramePr>
               <a:graphicFrameLocks noChangeAspect="1"/>
@@ -3537,7 +3702,7 @@
                   <pic:spPr>
                     <a:xfrm>
                       <a:off x="0" y="0"/>
-                      <a:ext cx="5303520" cy="2666960"/>
+                      <a:ext cx="5303520" cy="2439412"/>
                     </a:xfrm>
                     <a:prstGeom prst="rect"/>
                   </pic:spPr>
@@ -5160,7 +5325,7 @@
         </w:rPr>
         <w:t>1. Đăng nhập vào trang https://github.com và bấm nút 'New repository'.</w:t>
         <w:br/>
-        <w:t>2. Đặt tên Repository theo Mã số sinh viên, ví dụ: billing-system-dtc245200xxx.</w:t>
+        <w:t>2. Đặt tên Repository theo Mã số sinh viên, ví dụ: billing-system-dtc245200207.</w:t>
         <w:br/>
         <w:t>3. Chọn chế độ Public và KHÔNG tích chọn thêm README hay .gitignore (vì đã có sẵn trong dự án).</w:t>
         <w:br/>
@@ -5207,7 +5372,7 @@
                 <w:color w:val="0F172A"/>
                 <w:sz w:val="18"/>
               </w:rPr>
-              <w:t>git remote add origin https://github.com/&lt;TAI_KHOAN_GITHUB&gt;/billing-system-dtc245200xxx.git</w:t>
+              <w:t>git remote add origin https://github.com/tuan2307106/billing-system-dtc245200207.git</w:t>
               <w:br/>
               <w:t>git push -u origin main</w:t>
             </w:r>

</xml_diff>